<commit_message>
Require a child safety officer for every organization: stored on the organization, asked at registration, shown on leader dashboard, profiles and the My path card, and required before approving learners
Co-Authored-By: Claude Sonnet 5.5 <noreply@anthropic.com>
</commit_message>
<xml_diff>
--- a/docs/Leader-Training.docx
+++ b/docs/Leader-Training.docx
@@ -206,7 +206,17 @@
         <w:t>My path card</w:t>
       </w:r>
       <w:r>
-        <w:t xml:space="preserve"> with the consent form, so parents know what the programme is for.</w:t>
+        <w:t xml:space="preserve"> with the consent form (print it from </w:t>
+      </w:r>
+      <w:r>
+        <w:rPr>
+          <w:rFonts w:ascii="Consolas" w:hAnsi="Consolas"/>
+          <w:sz w:val="19"/>
+        </w:rPr>
+        <w:t>nextvillage.community/my-path?code=</w:t>
+      </w:r>
+      <w:r>
+        <w:t xml:space="preserve"> followed by your join code, so your child safety officer's details appear), so parents know what the programme is for.</w:t>
       </w:r>
     </w:p>
     <w:p>

</xml_diff>

<commit_message>
Require a child safety officer for every organization: stored on the organization, asked at registration, shown on leader dashboard, profiles and the My path card, and required before approving learners (#310)
Co-authored-by: Claude Sonnet 5.5 <noreply@anthropic.com>
</commit_message>
<xml_diff>
--- a/docs/Leader-Training.docx
+++ b/docs/Leader-Training.docx
@@ -206,7 +206,17 @@
         <w:t>My path card</w:t>
       </w:r>
       <w:r>
-        <w:t xml:space="preserve"> with the consent form, so parents know what the programme is for.</w:t>
+        <w:t xml:space="preserve"> with the consent form (print it from </w:t>
+      </w:r>
+      <w:r>
+        <w:rPr>
+          <w:rFonts w:ascii="Consolas" w:hAnsi="Consolas"/>
+          <w:sz w:val="19"/>
+        </w:rPr>
+        <w:t>nextvillage.community/my-path?code=</w:t>
+      </w:r>
+      <w:r>
+        <w:t xml:space="preserve"> followed by your join code, so your child safety officer's details appear), so parents know what the programme is for.</w:t>
       </w:r>
     </w:p>
     <w:p>

</xml_diff>